<commit_message>
docs(wiki): rebuild ops-troubleshooting docx
Co-Authored-By: Claude Opus 5.5 <noreply@anthropic.com>
Claude-Session: https://claude.ai/code/session_01KdRg4KoeiDi6Yth5vSXGEK
</commit_message>
<xml_diff>
--- a/docs/wiki/ops-troubleshooting.docx
+++ b/docs/wiki/ops-troubleshooting.docx
@@ -23,7 +23,7 @@
         <w:pStyle w:val="Date"/>
       </w:pPr>
       <w:r>
-        <w:t xml:space="preserve">Generated 2026-10-28 from git 2a696bd ��� do not edit this file, edit the Markdown in docs/</w:t>
+        <w:t xml:space="preserve">Generated 2026-10-28 from git 7410ef6 ��� do not edit this file, edit the Markdown in docs/</w:t>
       </w:r>
     </w:p>
     <w:p>
@@ -1469,6 +1469,39 @@
               </w:rPr>
               <w:t xml:space="preserve">session opened</w:t>
             </w:r>
+            <w:r>
+              <w:t xml:space="preserve">; no</w:t>
+            </w:r>
+            <w:r>
+              <w:t xml:space="preserve"> </w:t>
+            </w:r>
+            <w:r>
+              <w:rPr>
+                <w:rStyle w:val="VerbatimChar"/>
+              </w:rPr>
+              <w:t xml:space="preserve">Error converting userIdentifier to username</w:t>
+            </w:r>
+            <w:r>
+              <w:t xml:space="preserve"> </w:t>
+            </w:r>
+            <w:r>
+              <w:t xml:space="preserve">(that line with a value like</w:t>
+            </w:r>
+            <w:r>
+              <w:t xml:space="preserve"> </w:t>
+            </w:r>
+            <w:r>
+              <w:rPr>
+                <w:rStyle w:val="VerbatimChar"/>
+              </w:rPr>
+              <w:t xml:space="preserve">name@domain</w:t>
+            </w:r>
+            <w:r>
+              <w:t xml:space="preserve"> </w:t>
+            </w:r>
+            <w:r>
+              <w:t xml:space="preserve">means the user typed an e-mail address instead of the username)</w:t>
+            </w:r>
           </w:p>
         </w:tc>
         <w:tc>
@@ -3555,23 +3588,33 @@
               <w:jc w:val="left"/>
             </w:pPr>
             <w:r>
-              <w:t xml:space="preserve">rsession did not act on SIGTERM. On 2026-10-28 it was still alive 1 h later</w:t>
-            </w:r>
-          </w:p>
-        </w:tc>
-        <w:tc>
-          <w:tcPr/>
-          <w:p>
-            <w:pPr>
-              <w:pStyle w:val="Compact"/>
-              <w:jc w:val="left"/>
-            </w:pPr>
-            <w:r>
-              <w:t xml:space="preserve">decide: keep it (step 2b below) or</w:t>
+              <w:t xml:space="preserve">rsession did not act on SIGTERM. On 2026-10-28 it was still alive hours later. RStudio Server OSS runs</w:t>
             </w:r>
             <w:r>
               <w:t xml:space="preserve"> </w:t>
             </w:r>
+            <w:r>
+              <w:rPr>
+                <w:bCs/>
+                <w:b/>
+              </w:rPr>
+              <w:t xml:space="preserve">one rsession per user</w:t>
+            </w:r>
+            <w:r>
+              <w:t xml:space="preserve"> </w:t>
+            </w:r>
+            <w:r>
+              <w:t xml:space="preserve">and sends every new login to it, so while it lives the user cannot get a fresh session</w:t>
+            </w:r>
+          </w:p>
+        </w:tc>
+        <w:tc>
+          <w:tcPr/>
+          <w:p>
+            <w:pPr>
+              <w:pStyle w:val="Compact"/>
+              <w:jc w:val="left"/>
+            </w:pPr>
             <w:r>
               <w:rPr>
                 <w:rStyle w:val="VerbatimChar"/>
@@ -3582,7 +3625,7 @@
               <w:t xml:space="preserve"> </w:t>
             </w:r>
             <w:r>
-              <w:t xml:space="preserve">(SIGKILL; the process cannot write anything more)</w:t>
+              <w:t xml:space="preserve">(SIGKILL; the process cannot write anything more). Keeping it (step 2b) is only an option if the user can actually get in</w:t>
             </w:r>
           </w:p>
         </w:tc>
@@ -4068,10 +4111,163 @@
         </w:rPr>
         <w:t xml:space="preserve"># files touched by the live session</w:t>
       </w:r>
+      <w:r>
+        <w:br/>
+      </w:r>
+      <w:r>
+        <w:rPr>
+          <w:rStyle w:val="FunctionTok"/>
+        </w:rPr>
+        <w:t xml:space="preserve">sudo</w:t>
+      </w:r>
+      <w:r>
+        <w:rPr>
+          <w:rStyle w:val="NormalTok"/>
+        </w:rPr>
+        <w:t xml:space="preserve"> </w:t>
+      </w:r>
+      <w:r>
+        <w:rPr>
+          <w:rStyle w:val="AttributeTok"/>
+        </w:rPr>
+        <w:t xml:space="preserve">-u</w:t>
+      </w:r>
+      <w:r>
+        <w:rPr>
+          <w:rStyle w:val="NormalTok"/>
+        </w:rPr>
+        <w:t xml:space="preserve"> </w:t>
+      </w:r>
+      <w:r>
+        <w:rPr>
+          <w:rStyle w:val="StringTok"/>
+        </w:rPr>
+        <w:t xml:space="preserve">"</w:t>
+      </w:r>
+      <w:r>
+        <w:rPr>
+          <w:rStyle w:val="VariableTok"/>
+        </w:rPr>
+        <w:t xml:space="preserve">$U</w:t>
+      </w:r>
+      <w:r>
+        <w:rPr>
+          <w:rStyle w:val="StringTok"/>
+        </w:rPr>
+        <w:t xml:space="preserve">"</w:t>
+      </w:r>
+      <w:r>
+        <w:rPr>
+          <w:rStyle w:val="NormalTok"/>
+        </w:rPr>
+        <w:t xml:space="preserve"> sh </w:t>
+      </w:r>
+      <w:r>
+        <w:rPr>
+          <w:rStyle w:val="AttributeTok"/>
+        </w:rPr>
+        <w:t xml:space="preserve">-c</w:t>
+      </w:r>
+      <w:r>
+        <w:rPr>
+          <w:rStyle w:val="NormalTok"/>
+        </w:rPr>
+        <w:t xml:space="preserve"> </w:t>
+      </w:r>
+      <w:r>
+        <w:rPr>
+          <w:rStyle w:val="StringTok"/>
+        </w:rPr>
+        <w:t xml:space="preserve">'grep "Reading rsession configuration" ~/.local/share/rstudio/log/rsession-*.log | tail -3'</w:t>
+      </w:r>
+      <w:r>
+        <w:rPr>
+          <w:rStyle w:val="NormalTok"/>
+        </w:rPr>
+        <w:t xml:space="preserve">   </w:t>
+      </w:r>
+      <w:r>
+        <w:rPr>
+          <w:rStyle w:val="CommentTok"/>
+        </w:rPr>
+        <w:t xml:space="preserve"># one new line per rsession start</w:t>
+      </w:r>
     </w:p>
     <w:p>
       <w:pPr>
         <w:pStyle w:val="FirstParagraph"/>
+      </w:pPr>
+      <w:r>
+        <w:rPr>
+          <w:bCs/>
+          <w:b/>
+        </w:rPr>
+        <w:t xml:space="preserve">Login accepted but no new rsession.</w:t>
+      </w:r>
+      <w:r>
+        <w:t xml:space="preserve"> </w:t>
+      </w:r>
+      <w:r>
+        <w:t xml:space="preserve">If the journal shows</w:t>
+      </w:r>
+      <w:r>
+        <w:t xml:space="preserve"> </w:t>
+      </w:r>
+      <w:r>
+        <w:rPr>
+          <w:rStyle w:val="VerbatimChar"/>
+        </w:rPr>
+        <w:t xml:space="preserve">granted access</w:t>
+      </w:r>
+      <w:r>
+        <w:t xml:space="preserve"> </w:t>
+      </w:r>
+      <w:r>
+        <w:t xml:space="preserve">for a login and the per-user rsession log gets no new</w:t>
+      </w:r>
+      <w:r>
+        <w:t xml:space="preserve"> </w:t>
+      </w:r>
+      <w:r>
+        <w:rPr>
+          <w:rStyle w:val="VerbatimChar"/>
+        </w:rPr>
+        <w:t xml:space="preserve">Reading rsession configuration</w:t>
+      </w:r>
+      <w:r>
+        <w:t xml:space="preserve"> </w:t>
+      </w:r>
+      <w:r>
+        <w:t xml:space="preserve">line, rserver attached the login to the rsession that already exists. When that rsession is the stuck one (alive for hours,</w:t>
+      </w:r>
+      <w:r>
+        <w:t xml:space="preserve"> </w:t>
+      </w:r>
+      <w:r>
+        <w:rPr>
+          <w:rStyle w:val="VerbatimChar"/>
+        </w:rPr>
+        <w:t xml:space="preserve">Sl</w:t>
+      </w:r>
+      <w:r>
+        <w:t xml:space="preserve">, CPU ≈ 0), every login lands on it:</w:t>
+      </w:r>
+      <w:r>
+        <w:t xml:space="preserve"> </w:t>
+      </w:r>
+      <w:r>
+        <w:rPr>
+          <w:rStyle w:val="VerbatimChar"/>
+        </w:rPr>
+        <w:t xml:space="preserve">sudo kill -9 &lt;pid&gt;</w:t>
+      </w:r>
+      <w:r>
+        <w:t xml:space="preserve">, then the next login starts a new rsession (and a new line appears in the log).</w:t>
+      </w:r>
+    </w:p>
+    <w:p>
+      <w:pPr>
+        <w:pStyle w:val="BodyText"/>
       </w:pPr>
       <w:r>
         <w:t xml:space="preserve">Ask the user to confirm that the IDE shows the Console prompt. CPU at 100% for minutes or a new "terminated abnormally" means the resume failed again: go to the next ladder step.</w:t>
@@ -5970,7 +6166,7 @@
         <w:t xml:space="preserve"> </w:t>
       </w:r>
       <w:r>
-        <w:t xml:space="preserve">or Session → Restart R): otherwise the next suspend writes the same payload again. If the IDE still does not load,</w:t>
+        <w:t xml:space="preserve">or Session → Restart R): otherwise the next suspend writes the same payload again. If the IDE still does not load, the live rsession is now the blocker (one rsession per user, see §3.3):</w:t>
       </w:r>
       <w:r>
         <w:t xml:space="preserve"> </w:t>
@@ -5985,7 +6181,35 @@
         <w:t xml:space="preserve"> </w:t>
       </w:r>
       <w:r>
-        <w:t xml:space="preserve">and the next login starts an empty session.</w:t>
+        <w:t xml:space="preserve">and the next login starts an empty session. On 2026-10-28 this variant did</w:t>
+      </w:r>
+      <w:r>
+        <w:t xml:space="preserve"> </w:t>
+      </w:r>
+      <w:r>
+        <w:rPr>
+          <w:bCs/>
+          <w:b/>
+        </w:rPr>
+        <w:t xml:space="preserve">not</w:t>
+      </w:r>
+      <w:r>
+        <w:t xml:space="preserve"> </w:t>
+      </w:r>
+      <w:r>
+        <w:t xml:space="preserve">work: the user could not get in until the old rsession was killed. Prefer step 2 with</w:t>
+      </w:r>
+      <w:r>
+        <w:t xml:space="preserve"> </w:t>
+      </w:r>
+      <w:r>
+        <w:rPr>
+          <w:rStyle w:val="VerbatimChar"/>
+        </w:rPr>
+        <w:t xml:space="preserve">kill -9</w:t>
+      </w:r>
+      <w:r>
+        <w:t xml:space="preserve">.</w:t>
       </w:r>
     </w:p>
     <w:p>
@@ -8871,6 +9095,124 @@
               <w:jc w:val="left"/>
             </w:pPr>
             <w:r>
+              <w:t xml:space="preserve">afternoon</w:t>
+            </w:r>
+          </w:p>
+        </w:tc>
+        <w:tc>
+          <w:tcPr/>
+          <w:p>
+            <w:pPr>
+              <w:pStyle w:val="Compact"/>
+              <w:jc w:val="left"/>
+            </w:pPr>
+            <w:r>
+              <w:t xml:space="preserve">user A still cannot get in: logins accepted (</w:t>
+            </w:r>
+            <w:r>
+              <w:rPr>
+                <w:rStyle w:val="VerbatimChar"/>
+              </w:rPr>
+              <w:t xml:space="preserve">granted access</w:t>
+            </w:r>
+            <w:r>
+              <w:t xml:space="preserve">) but no new</w:t>
+            </w:r>
+            <w:r>
+              <w:t xml:space="preserve"> </w:t>
+            </w:r>
+            <w:r>
+              <w:rPr>
+                <w:rStyle w:val="VerbatimChar"/>
+              </w:rPr>
+              <w:t xml:space="preserve">Reading rsession configuration</w:t>
+            </w:r>
+            <w:r>
+              <w:t xml:space="preserve"> </w:t>
+            </w:r>
+            <w:r>
+              <w:t xml:space="preserve">line in the rsession log, because rserver kept routing them to the old, idle rsession</w:t>
+            </w:r>
+          </w:p>
+        </w:tc>
+        <w:tc>
+          <w:tcPr/>
+          <w:p>
+            <w:pPr>
+              <w:pStyle w:val="Compact"/>
+              <w:jc w:val="left"/>
+            </w:pPr>
+            <w:r>
+              <w:t xml:space="preserve">journal,</w:t>
+            </w:r>
+            <w:r>
+              <w:t xml:space="preserve"> </w:t>
+            </w:r>
+            <w:r>
+              <w:rPr>
+                <w:rStyle w:val="VerbatimChar"/>
+              </w:rPr>
+              <w:t xml:space="preserve">~/.local/share/rstudio/log/rsession-&lt;user&gt;.log</w:t>
+            </w:r>
+          </w:p>
+        </w:tc>
+      </w:tr>
+      <w:tr>
+        <w:tc>
+          <w:tcPr/>
+          <w:p>
+            <w:pPr>
+              <w:pStyle w:val="Compact"/>
+              <w:jc w:val="left"/>
+            </w:pPr>
+            <w:r>
+              <w:t xml:space="preserve">evening</w:t>
+            </w:r>
+          </w:p>
+        </w:tc>
+        <w:tc>
+          <w:tcPr/>
+          <w:p>
+            <w:pPr>
+              <w:pStyle w:val="Compact"/>
+              <w:jc w:val="left"/>
+            </w:pPr>
+            <w:r>
+              <w:t xml:space="preserve">old rsession stopped with</w:t>
+            </w:r>
+            <w:r>
+              <w:t xml:space="preserve"> </w:t>
+            </w:r>
+            <w:r>
+              <w:rPr>
+                <w:rStyle w:val="VerbatimChar"/>
+              </w:rPr>
+              <w:t xml:space="preserve">kill -9</w:t>
+            </w:r>
+          </w:p>
+        </w:tc>
+        <w:tc>
+          <w:tcPr/>
+          <w:p>
+            <w:pPr>
+              <w:pStyle w:val="Compact"/>
+              <w:jc w:val="left"/>
+            </w:pPr>
+            <w:r>
+              <w:t xml:space="preserve">operator shell</w:t>
+            </w:r>
+          </w:p>
+        </w:tc>
+      </w:tr>
+      <w:tr>
+        <w:tc>
+          <w:tcPr/>
+          <w:p>
+            <w:pPr>
+              <w:pStyle w:val="Compact"/>
+              <w:jc w:val="left"/>
+            </w:pPr>
+            <w:r>
               <w:t xml:space="preserve">pending</w:t>
             </w:r>
           </w:p>
@@ -9479,7 +9821,22 @@
         <w:t xml:space="preserve"> </w:t>
       </w:r>
       <w:r>
-        <w:t xml:space="preserve">ran anyway. The process then stayed alive for over an hour: rsession did not act on SIGTERM. Here it did no harm (the resume was finished and the payload did not come back), but always read</w:t>
+        <w:t xml:space="preserve">ran anyway. The process then stayed alive for over an hour: rsession did not act on SIGTERM. The payload did not come back, but the live rsession then absorbed every new login of the user for hours (one rsession per user on RStudio Server OSS). Use</w:t>
+      </w:r>
+      <w:r>
+        <w:t xml:space="preserve"> </w:t>
+      </w:r>
+      <w:r>
+        <w:rPr>
+          <w:rStyle w:val="VerbatimChar"/>
+        </w:rPr>
+        <w:t xml:space="preserve">kill -9</w:t>
+      </w:r>
+      <w:r>
+        <w:t xml:space="preserve"> </w:t>
+      </w:r>
+      <w:r>
+        <w:t xml:space="preserve">and confirm with</w:t>
       </w:r>
       <w:r>
         <w:t xml:space="preserve"> </w:t>
@@ -9494,7 +9851,34 @@
         <w:t xml:space="preserve"> </w:t>
       </w:r>
       <w:r>
-        <w:t xml:space="preserve">before moving anything and choose 2 or 2b on purpose (§4.1).</w:t>
+        <w:t xml:space="preserve">before moving anything (§4.1 step 2).</w:t>
+      </w:r>
+    </w:p>
+    <w:p>
+      <w:pPr>
+        <w:numPr>
+          <w:ilvl w:val="0"/>
+          <w:numId w:val="1005"/>
+        </w:numPr>
+        <w:pStyle w:val="Compact"/>
+      </w:pPr>
+      <w:r>
+        <w:t xml:space="preserve">"Login works" in the journal does not mean a session started: check the per-user rsession log for a new</w:t>
+      </w:r>
+      <w:r>
+        <w:t xml:space="preserve"> </w:t>
+      </w:r>
+      <w:r>
+        <w:rPr>
+          <w:rStyle w:val="VerbatimChar"/>
+        </w:rPr>
+        <w:t xml:space="preserve">Reading rsession configuration</w:t>
+      </w:r>
+      <w:r>
+        <w:t xml:space="preserve"> </w:t>
+      </w:r>
+      <w:r>
+        <w:t xml:space="preserve">line (§3.4).</w:t>
       </w:r>
     </w:p>
     <w:p>
@@ -9998,7 +10382,7 @@
         <w:pStyle w:val="Compact"/>
       </w:pPr>
       <w:r>
-        <w:t xml:space="preserve">Observed on 2026-10-28: rsession did not exit on SIGTERM for over an hour. Whether it would write a new suspended state on a later exit is not verified; the ladder checks for it.</w:t>
+        <w:t xml:space="preserve">Observed on 2026-10-28: rsession did not exit on SIGTERM for hours. Whether it would write a new suspended state on a later exit is not verified; the ladder checks for it.</w:t>
       </w:r>
     </w:p>
     <w:p>
@@ -14694,16 +15078,64 @@
         <w:t xml:space="preserve"> </w:t>
       </w:r>
       <w:r>
-        <w:t xml:space="preserve">If the rsession ignores SIGTERM but its resume is finished (</w:t>
-      </w:r>
-      <w:r>
-        <w:rPr>
-          <w:rStyle w:val="VerbatimChar"/>
-        </w:rPr>
-        <w:t xml:space="preserve">Sl</w:t>
-      </w:r>
-      <w:r>
-        <w:t xml:space="preserve">, CPU ≈ 0, RSS stable), moving the payload while it stays alive is safe: the user logs in to the live session, then saves and clears the large objects (guide §4.1 step 2b). Check the backup as the user:</w:t>
+        <w:t xml:space="preserve">Do not leave an old rsession alive after moving the payload: RStudio Server OSS runs one rsession per user and routes every new login to it, so a stuck one keeps the user out (journal says</w:t>
+      </w:r>
+      <w:r>
+        <w:t xml:space="preserve"> </w:t>
+      </w:r>
+      <w:r>
+        <w:rPr>
+          <w:rStyle w:val="VerbatimChar"/>
+        </w:rPr>
+        <w:t xml:space="preserve">granted access</w:t>
+      </w:r>
+      <w:r>
+        <w:t xml:space="preserve">, but the per-user</w:t>
+      </w:r>
+      <w:r>
+        <w:t xml:space="preserve"> </w:t>
+      </w:r>
+      <w:r>
+        <w:rPr>
+          <w:rStyle w:val="VerbatimChar"/>
+        </w:rPr>
+        <w:t xml:space="preserve">~/.local/share/rstudio/log/rsession-&lt;user&gt;.log</w:t>
+      </w:r>
+      <w:r>
+        <w:t xml:space="preserve"> </w:t>
+      </w:r>
+      <w:r>
+        <w:t xml:space="preserve">gets no new</w:t>
+      </w:r>
+      <w:r>
+        <w:t xml:space="preserve"> </w:t>
+      </w:r>
+      <w:r>
+        <w:rPr>
+          <w:rStyle w:val="VerbatimChar"/>
+        </w:rPr>
+        <w:t xml:space="preserve">Reading rsession configuration</w:t>
+      </w:r>
+      <w:r>
+        <w:t xml:space="preserve"> </w:t>
+      </w:r>
+      <w:r>
+        <w:t xml:space="preserve">line).</w:t>
+      </w:r>
+      <w:r>
+        <w:t xml:space="preserve"> </w:t>
+      </w:r>
+      <w:r>
+        <w:rPr>
+          <w:rStyle w:val="VerbatimChar"/>
+        </w:rPr>
+        <w:t xml:space="preserve">kill -9</w:t>
+      </w:r>
+      <w:r>
+        <w:t xml:space="preserve"> </w:t>
+      </w:r>
+      <w:r>
+        <w:t xml:space="preserve">it (guide §3.3–§3.4). Check the backup as the user:</w:t>
       </w:r>
       <w:r>
         <w:t xml:space="preserve"> </w:t>
@@ -14896,7 +15328,37 @@
         <w:t xml:space="preserve"> </w:t>
       </w:r>
       <w:r>
-        <w:t xml:space="preserve">with stable RSS, the journal has no new "terminated abnormally", and the user sees the Console prompt (guide §3.4). Prevention of forced suspends by unattended upgrades: ADR-0007 in PR #53.</w:t>
+        <w:t xml:space="preserve">with stable RSS, the journal has no new "terminated abnormally", the rsession log has a new</w:t>
+      </w:r>
+      <w:r>
+        <w:t xml:space="preserve"> </w:t>
+      </w:r>
+      <w:r>
+        <w:rPr>
+          <w:rStyle w:val="VerbatimChar"/>
+        </w:rPr>
+        <w:t xml:space="preserve">Reading rsession configuration</w:t>
+      </w:r>
+      <w:r>
+        <w:t xml:space="preserve"> </w:t>
+      </w:r>
+      <w:r>
+        <w:t xml:space="preserve">line for this login, and the user sees the Console prompt (guide §3.4). A journal line</w:t>
+      </w:r>
+      <w:r>
+        <w:t xml:space="preserve"> </w:t>
+      </w:r>
+      <w:r>
+        <w:rPr>
+          <w:rStyle w:val="VerbatimChar"/>
+        </w:rPr>
+        <w:t xml:space="preserve">Error converting userIdentifier to username</w:t>
+      </w:r>
+      <w:r>
+        <w:t xml:space="preserve"> </w:t>
+      </w:r>
+      <w:r>
+        <w:t xml:space="preserve">with an e-mail-like value means the user typed an e-mail address instead of the username. Prevention of forced suspends by unattended upgrades: ADR-0007 in PR #53.</w:t>
       </w:r>
     </w:p>
     <w:bookmarkEnd w:id="49"/>

</xml_diff>